<commit_message>
Actualizacion Final: Generadas e integradas todas las imagenes escenicas 8k exclusivas para Oni no Ketsuryu Vol 2, Vol 3 y Vol 4
</commit_message>
<xml_diff>
--- a/libros/oni-no-ketsuryu-volumen-2/libro.docx
+++ b/libros/oni-no-ketsuryu-volumen-2/libro.docx
@@ -891,11 +891,11 @@
               <a:graphicData uri="http://schemas.openxmlformats.org/drawingml/2006/picture">
                 <pic:pic>
                   <pic:nvPicPr>
-                    <pic:cNvPr id="0" name="escena_1.jpg"/>
+                    <pic:cNvPr id="0" name="escena_climax.jpg"/>
                     <pic:cNvPicPr/>
                   </pic:nvPicPr>
                   <pic:blipFill>
-                    <a:blip r:embed="rId10"/>
+                    <a:blip r:embed="rId11"/>
                     <a:stretch>
                       <a:fillRect/>
                     </a:stretch>

</xml_diff>